<commit_message>
feat(template): add resourceUrl and updatedAt to public API VO
- Add resourceUrl (ZIP download URL from version storage_url) and
  updatedAt to TplTemplateVO for Unity client integration
- Add cover image upload to resource server in template creation
- Fix frontend stale upload state with clearFiles() on dialog open
- Fix category cascader emitPath:true value extraction
- Fix templateCode generation length check and add deleted=0 filter
- Update resource server config to HFS paths
- Update admin template list with cover upload and download link

Co-Authored-By: Claude Opus 4.7 <noreply@anthropic.com>
</commit_message>
<xml_diff>
--- a/EISP后端管理页面说明文档.docx
+++ b/EISP后端管理页面说明文档.docx
@@ -2394,31 +2394,62 @@
         </w:tc>
       </w:tr>
     </w:tbl>
-    <w:p/>
-    <w:p>
+    <w:p>
+      <w:pPr>
+        <w:rPr>
+          <w:rFonts w:hint="eastAsia"/>
+        </w:rPr>
+      </w:pPr>
+    </w:p>
+    <w:p>
+      <w:pPr>
+        <w:rPr>
+          <w:rFonts w:hint="eastAsia"/>
+        </w:rPr>
+      </w:pPr>
       <w:bookmarkStart w:id="0" w:name="OLE_LINK16"/>
       <w:r>
         <w:t>模板表</w:t>
       </w:r>
     </w:p>
     <w:p>
+      <w:pPr>
+        <w:rPr>
+          <w:rFonts w:hint="eastAsia"/>
+        </w:rPr>
+      </w:pPr>
       <w:r>
         <w:t>主要字段</w:t>
       </w:r>
     </w:p>
     <w:p>
+      <w:pPr>
+        <w:rPr>
+          <w:rFonts w:hint="eastAsia"/>
+        </w:rPr>
+      </w:pPr>
       <w:r>
         <w:t>主键id</w:t>
       </w:r>
     </w:p>
     <w:p>
-      <w:r>
-        <w:t xml:space="preserve">    模板名称</w:t>
-      </w:r>
-    </w:p>
-    <w:p>
-      <w:r>
-        <w:t xml:space="preserve">    模板描述</w:t>
+      <w:pPr>
+        <w:rPr>
+          <w:rFonts w:hint="eastAsia"/>
+        </w:rPr>
+      </w:pPr>
+      <w:r>
+        <w:t>模板名称</w:t>
+      </w:r>
+    </w:p>
+    <w:p>
+      <w:pPr>
+        <w:rPr>
+          <w:rFonts w:hint="eastAsia"/>
+        </w:rPr>
+      </w:pPr>
+      <w:r>
+        <w:t>模板描述</w:t>
       </w:r>
     </w:p>
     <w:p>
@@ -2427,127 +2458,276 @@
       </w:r>
     </w:p>
     <w:p>
+      <w:pPr>
+        <w:rPr>
+          <w:rFonts w:hint="eastAsia"/>
+        </w:rPr>
+      </w:pPr>
       <w:r>
         <w:lastRenderedPageBreak/>
+        <w:t>简介</w:t>
+      </w:r>
+    </w:p>
+    <w:p>
+      <w:pPr>
+        <w:rPr>
+          <w:rFonts w:hint="eastAsia"/>
+        </w:rPr>
+      </w:pPr>
+      <w:r>
+        <w:t>详细描述</w:t>
+      </w:r>
+    </w:p>
+    <w:p>
+      <w:pPr>
+        <w:rPr>
+          <w:rFonts w:hint="eastAsia"/>
+        </w:rPr>
+      </w:pPr>
+      <w:r>
+        <w:t>创作者</w:t>
+      </w:r>
+    </w:p>
+    <w:p>
+      <w:pPr>
+        <w:rPr>
+          <w:rFonts w:hint="eastAsia"/>
+        </w:rPr>
+      </w:pPr>
+      <w:r>
+        <w:t>创作时间</w:t>
+      </w:r>
+    </w:p>
+    <w:p>
+      <w:pPr>
+        <w:rPr>
+          <w:rFonts w:hint="eastAsia"/>
+        </w:rPr>
+      </w:pPr>
+      <w:r>
         <w:t>上线时间</w:t>
       </w:r>
     </w:p>
     <w:p>
+      <w:pPr>
+        <w:rPr>
+          <w:rFonts w:hint="eastAsia"/>
+        </w:rPr>
+      </w:pPr>
       <w:r>
         <w:t>难度系数</w:t>
       </w:r>
     </w:p>
     <w:p>
+      <w:pPr>
+        <w:rPr>
+          <w:rFonts w:hint="eastAsia"/>
+        </w:rPr>
+      </w:pPr>
       <w:r>
         <w:t>下载人数</w:t>
       </w:r>
     </w:p>
     <w:p>
+      <w:pPr>
+        <w:rPr>
+          <w:rFonts w:hint="eastAsia"/>
+        </w:rPr>
+      </w:pPr>
       <w:r>
         <w:t>是否付费</w:t>
       </w:r>
     </w:p>
     <w:p>
-      <w:r>
-        <w:t>顶级id</w:t>
-      </w:r>
-    </w:p>
-    <w:p>
-      <w:r>
-        <w:t>一级id</w:t>
-      </w:r>
-    </w:p>
-    <w:p>
-      <w:r>
-        <w:t>二级id</w:t>
-      </w:r>
-    </w:p>
-    <w:p>
+      <w:pPr>
+        <w:rPr>
+          <w:rFonts w:hint="eastAsia"/>
+        </w:rPr>
+      </w:pPr>
+      <w:r>
+        <w:rPr>
+          <w:rFonts w:hint="eastAsia"/>
+        </w:rPr>
+        <w:t>顶级分类</w:t>
+      </w:r>
+      <w:r>
+        <w:t>id</w:t>
+      </w:r>
+    </w:p>
+    <w:p>
+      <w:pPr>
+        <w:rPr>
+          <w:rFonts w:hint="eastAsia"/>
+        </w:rPr>
+      </w:pPr>
+      <w:r>
+        <w:t>一级</w:t>
+      </w:r>
+      <w:r>
+        <w:rPr>
+          <w:rFonts w:hint="eastAsia"/>
+        </w:rPr>
+        <w:t>分类</w:t>
+      </w:r>
+      <w:r>
+        <w:t>id</w:t>
+      </w:r>
+    </w:p>
+    <w:p>
+      <w:pPr>
+        <w:rPr>
+          <w:rFonts w:hint="eastAsia"/>
+        </w:rPr>
+      </w:pPr>
+      <w:r>
+        <w:t>二级</w:t>
+      </w:r>
+      <w:r>
+        <w:rPr>
+          <w:rFonts w:hint="eastAsia"/>
+        </w:rPr>
+        <w:t>分类</w:t>
+      </w:r>
+      <w:r>
+        <w:t>id</w:t>
+      </w:r>
+    </w:p>
+    <w:p>
+      <w:pPr>
+        <w:rPr>
+          <w:rFonts w:hint="eastAsia"/>
+        </w:rPr>
+      </w:pPr>
       <w:r>
         <w:t>版本号</w:t>
       </w:r>
     </w:p>
     <w:p>
+      <w:pPr>
+        <w:rPr>
+          <w:rFonts w:hint="eastAsia"/>
+        </w:rPr>
+      </w:pPr>
       <w:r>
         <w:t>更新时间</w:t>
       </w:r>
     </w:p>
     <w:p>
+      <w:pPr>
+        <w:rPr>
+          <w:rFonts w:hint="eastAsia"/>
+        </w:rPr>
+      </w:pPr>
       <w:r>
         <w:t>难度等级</w:t>
       </w:r>
     </w:p>
     <w:p>
+      <w:pPr>
+        <w:rPr>
+          <w:rFonts w:hint="eastAsia"/>
+        </w:rPr>
+      </w:pPr>
       <w:r>
         <w:t>有效时间</w:t>
       </w:r>
     </w:p>
     <w:p>
+      <w:pPr>
+        <w:rPr>
+          <w:rFonts w:hint="eastAsia"/>
+        </w:rPr>
+      </w:pPr>
       <w:r>
         <w:t>是否付费</w:t>
       </w:r>
     </w:p>
     <w:p>
+      <w:pPr>
+        <w:rPr>
+          <w:rFonts w:hint="eastAsia"/>
+        </w:rPr>
+      </w:pPr>
       <w:r>
         <w:t>费用类型</w:t>
       </w:r>
     </w:p>
     <w:p>
+      <w:pPr>
+        <w:rPr>
+          <w:rFonts w:hint="eastAsia"/>
+        </w:rPr>
+      </w:pPr>
       <w:r>
         <w:t>下载次数</w:t>
       </w:r>
     </w:p>
     <w:p>
+      <w:pPr>
+        <w:rPr>
+          <w:rFonts w:hint="eastAsia"/>
+        </w:rPr>
+      </w:pPr>
       <w:r>
         <w:t xml:space="preserve">状态 </w:t>
       </w:r>
     </w:p>
     <w:p>
+      <w:pPr>
+        <w:rPr>
+          <w:rFonts w:hint="eastAsia"/>
+        </w:rPr>
+      </w:pPr>
       <w:r>
         <w:t xml:space="preserve">     下架</w:t>
       </w:r>
     </w:p>
     <w:p>
+      <w:pPr>
+        <w:rPr>
+          <w:rFonts w:hint="eastAsia"/>
+        </w:rPr>
+      </w:pPr>
       <w:r>
         <w:t xml:space="preserve">     上架</w:t>
       </w:r>
     </w:p>
     <w:p>
+      <w:pPr>
+        <w:rPr>
+          <w:rFonts w:hint="eastAsia"/>
+        </w:rPr>
+      </w:pPr>
       <w:r>
         <w:t xml:space="preserve">     违规</w:t>
       </w:r>
     </w:p>
     <w:p>
+      <w:pPr>
+        <w:rPr>
+          <w:rFonts w:hint="eastAsia"/>
+        </w:rPr>
+      </w:pPr>
       <w:r>
         <w:t xml:space="preserve">     正常</w:t>
       </w:r>
     </w:p>
     <w:p>
-      <w:r>
-        <w:t>简介</w:t>
-      </w:r>
-    </w:p>
-    <w:p>
-      <w:r>
-        <w:t>详细描述</w:t>
-      </w:r>
-    </w:p>
-    <w:p>
-      <w:r>
-        <w:t>创作者</w:t>
-      </w:r>
-    </w:p>
-    <w:p>
-      <w:r>
-        <w:t>创作时间</w:t>
-      </w:r>
-    </w:p>
-    <w:p>
+      <w:pPr>
+        <w:rPr>
+          <w:rFonts w:hint="eastAsia"/>
+        </w:rPr>
+      </w:pPr>
       <w:r>
         <w:t>收藏数</w:t>
       </w:r>
     </w:p>
     <w:p>
+      <w:pPr>
+        <w:rPr>
+          <w:rFonts w:hint="eastAsia"/>
+        </w:rPr>
+      </w:pPr>
       <w:r>
         <w:t>资源路径</w:t>
       </w:r>
@@ -2563,6 +2743,9 @@
     <w:p>
       <w:pPr>
         <w:pStyle w:val="3"/>
+        <w:rPr>
+          <w:rFonts w:hint="eastAsia"/>
+        </w:rPr>
       </w:pPr>
     </w:p>
     <w:p>
@@ -6672,6 +6855,7 @@
   <w:style w:type="character" w:default="1" w:styleId="a0">
     <w:name w:val="Default Paragraph Font"/>
     <w:uiPriority w:val="1"/>
+    <w:semiHidden/>
     <w:unhideWhenUsed/>
   </w:style>
   <w:style w:type="table" w:default="1" w:styleId="a1">

</xml_diff>